<commit_message>
Fixing the templates to match the appropriate style
</commit_message>
<xml_diff>
--- a/backend/DocumentService/src/main/resources/templates/document/analysis-template.docx
+++ b/backend/DocumentService/src/main/resources/templates/document/analysis-template.docx
@@ -1,95 +1,599 @@
 
 <file path=word/document.xml><?xml version="1.0" encoding="utf-8"?>
-<w:document xmlns:wpc="http://schemas.microsoft.com/office/word/2010/wordprocessingCanvas" xmlns:cx="http://schemas.microsoft.com/office/drawing/2014/chartex" xmlns:cx1="http://schemas.microsoft.com/office/drawing/2015/9/8/chartex" xmlns:cx2="http://schemas.microsoft.com/office/drawing/2015/10/21/chartex" xmlns:cx3="http://schemas.microsoft.com/office/drawing/2016/5/9/chartex" xmlns:cx4="http://schemas.microsoft.com/office/drawing/2016/5/10/chartex" xmlns:cx5="http://schemas.microsoft.com/office/drawing/2016/5/11/chartex" xmlns:cx6="http://schemas.microsoft.com/office/drawing/2016/5/12/chartex" xmlns:cx7="http://schemas.microsoft.com/office/drawing/2016/5/13/chartex" xmlns:cx8="http://schemas.microsoft.com/office/drawing/2016/5/14/chartex" xmlns:mc="http://schemas.openxmlformats.org/markup-compatibility/2006" xmlns:aink="http://schemas.microsoft.com/office/drawing/2016/ink" xmlns:am3d="http://schemas.microsoft.com/office/drawing/2017/model3d" xmlns:o="urn:schemas-microsoft-com:office:office" xmlns:oel="http://schemas.microsoft.com/office/2019/extlst" xmlns:r="http://schemas.openxmlformats.org/officeDocument/2006/relationships" xmlns:m="http://schemas.openxmlformats.org/officeDocument/2006/math" xmlns:v="urn:schemas-microsoft-com:vml" xmlns:wp14="http://schemas.microsoft.com/office/word/2010/wordprocessingDrawing" xmlns:wp="http://schemas.openxmlformats.org/drawingml/2006/wordprocessingDrawing" xmlns:w10="urn:schemas-microsoft-com:office:word" xmlns:w="http://schemas.openxmlformats.org/wordprocessingml/2006/main" xmlns:w14="http://schemas.microsoft.com/office/word/2010/wordml" xmlns:w15="http://schemas.microsoft.com/office/word/2012/wordml" xmlns:w16cex="http://schemas.microsoft.com/office/word/2018/wordml/cex" xmlns:w16cid="http://schemas.microsoft.com/office/word/2016/wordml/cid" xmlns:w16="http://schemas.microsoft.com/office/word/2018/wordml" xmlns:w16du="http://schemas.microsoft.com/office/word/2023/wordml/word16du" xmlns:w16sdtdh="http://schemas.microsoft.com/office/word/2020/wordml/sdtdatahash" xmlns:w16sdtfl="http://schemas.microsoft.com/office/word/2024/wordml/sdtformatlock" xmlns:w16se="http://schemas.microsoft.com/office/word/2015/wordml/symex" xmlns:wpg="http://schemas.microsoft.com/office/word/2010/wordprocessingGroup" xmlns:wpi="http://schemas.microsoft.com/office/word/2010/wordprocessingInk" xmlns:wne="http://schemas.microsoft.com/office/word/2006/wordml" xmlns:wps="http://schemas.microsoft.com/office/word/2010/wordprocessingShape" mc:Ignorable="w14 w15 w16se w16cid w16 w16cex w16sdtdh w16sdtfl w16du wp14">
+<w:document xmlns:wpc="http://schemas.microsoft.com/office/word/2010/wordprocessingCanvas" xmlns:cx="http://schemas.microsoft.com/office/drawing/2014/chartex" xmlns:cx1="http://schemas.microsoft.com/office/drawing/2015/9/8/chartex" xmlns:mc="http://schemas.openxmlformats.org/markup-compatibility/2006" xmlns:o="urn:schemas-microsoft-com:office:office" xmlns:r="http://schemas.openxmlformats.org/officeDocument/2006/relationships" xmlns:m="http://schemas.openxmlformats.org/officeDocument/2006/math" xmlns:v="urn:schemas-microsoft-com:vml" xmlns:wp14="http://schemas.microsoft.com/office/word/2010/wordprocessingDrawing" xmlns:wp="http://schemas.openxmlformats.org/drawingml/2006/wordprocessingDrawing" xmlns:w10="urn:schemas-microsoft-com:office:word" xmlns:w="http://schemas.openxmlformats.org/wordprocessingml/2006/main" xmlns:w14="http://schemas.microsoft.com/office/word/2010/wordml" xmlns:w15="http://schemas.microsoft.com/office/word/2012/wordml" xmlns:w16se="http://schemas.microsoft.com/office/word/2015/wordml/symex" xmlns:wpg="http://schemas.microsoft.com/office/word/2010/wordprocessingGroup" xmlns:wpi="http://schemas.microsoft.com/office/word/2010/wordprocessingInk" xmlns:wne="http://schemas.microsoft.com/office/word/2006/wordml" xmlns:wps="http://schemas.microsoft.com/office/word/2010/wordprocessingShape" mc:Ignorable="w14 w15 w16se wp14">
   <w:body>
-    <w:p>
-      <w:pPr>
-        <w:spacing w:before="720" w:after="120"/>
-        <w:jc w:val="center"/>
-      </w:pPr>
-      <w:r>
+    <w:tbl>
+      <w:tblPr>
+        <w:tblStyle w:val="TableGrid"/>
+        <w:tblpPr w:leftFromText="141" w:rightFromText="141" w:vertAnchor="text" w:horzAnchor="margin" w:tblpY="86"/>
+        <w:tblW w:w="3426" w:type="dxa"/>
+        <w:tblBorders>
+          <w:top w:val="none" w:sz="0" w:space="0" w:color="auto"/>
+          <w:left w:val="none" w:sz="0" w:space="0" w:color="auto"/>
+          <w:bottom w:val="none" w:sz="0" w:space="0" w:color="auto"/>
+          <w:right w:val="none" w:sz="0" w:space="0" w:color="auto"/>
+          <w:insideH w:val="none" w:sz="0" w:space="0" w:color="auto"/>
+          <w:insideV w:val="none" w:sz="0" w:space="0" w:color="auto"/>
+        </w:tblBorders>
+        <w:tblLook w:val="04A0" w:firstRow="1" w:lastRow="0" w:firstColumn="1" w:lastColumn="0" w:noHBand="0" w:noVBand="1"/>
+      </w:tblPr>
+      <w:tblGrid>
+        <w:gridCol w:w="3426"/>
+      </w:tblGrid>
+      <w:tr>
+        <w:trPr>
+          <w:trHeight w:val="301"/>
+        </w:trPr>
+        <w:tc>
+          <w:tcPr>
+            <w:tcW w:w="0" w:type="auto"/>
+            <w:vAlign w:val="center"/>
+          </w:tcPr>
+          <w:p>
+            <w:pPr>
+              <w:tabs>
+                <w:tab w:val="left" w:pos="2137"/>
+              </w:tabs>
+              <w:ind w:firstLine="0"/>
+              <w:jc w:val="center"/>
+              <w:rPr>
+                <w:sz w:val="20"/>
+                <w:szCs w:val="20"/>
+              </w:rPr>
+            </w:pPr>
+            <w:r>
+              <w:rPr>
+                <w:sz w:val="20"/>
+                <w:szCs w:val="20"/>
+              </w:rPr>
+              <w:t>REPUBLIQUE DU CAMEROUN</w:t>
+            </w:r>
+          </w:p>
+        </w:tc>
+      </w:tr>
+      <w:tr>
+        <w:trPr>
+          <w:trHeight w:val="301"/>
+        </w:trPr>
+        <w:tc>
+          <w:tcPr>
+            <w:tcW w:w="0" w:type="auto"/>
+            <w:vAlign w:val="center"/>
+          </w:tcPr>
+          <w:p>
+            <w:pPr>
+              <w:tabs>
+                <w:tab w:val="left" w:pos="2137"/>
+              </w:tabs>
+              <w:ind w:firstLine="0"/>
+              <w:jc w:val="center"/>
+              <w:rPr>
+                <w:sz w:val="20"/>
+                <w:szCs w:val="20"/>
+              </w:rPr>
+            </w:pPr>
+            <w:r>
+              <w:rPr>
+                <w:sz w:val="20"/>
+                <w:szCs w:val="20"/>
+              </w:rPr>
+              <w:t>*****</w:t>
+            </w:r>
+          </w:p>
+        </w:tc>
+      </w:tr>
+      <w:tr>
+        <w:trPr>
+          <w:trHeight w:val="301"/>
+        </w:trPr>
+        <w:tc>
+          <w:tcPr>
+            <w:tcW w:w="0" w:type="auto"/>
+            <w:vAlign w:val="center"/>
+          </w:tcPr>
+          <w:p>
+            <w:pPr>
+              <w:tabs>
+                <w:tab w:val="left" w:pos="2137"/>
+              </w:tabs>
+              <w:ind w:firstLine="0"/>
+              <w:jc w:val="center"/>
+              <w:rPr>
+                <w:sz w:val="20"/>
+                <w:szCs w:val="20"/>
+              </w:rPr>
+            </w:pPr>
+            <w:r>
+              <w:rPr>
+                <w:sz w:val="20"/>
+                <w:szCs w:val="20"/>
+              </w:rPr>
+              <w:t>Paix-Travail-Patrie</w:t>
+            </w:r>
+          </w:p>
+        </w:tc>
+      </w:tr>
+    </w:tbl>
+    <w:tbl>
+      <w:tblPr>
+        <w:tblStyle w:val="TableGrid"/>
+        <w:tblpPr w:leftFromText="141" w:rightFromText="141" w:vertAnchor="text" w:horzAnchor="margin" w:tblpXSpec="right" w:tblpY="66"/>
+        <w:tblOverlap w:val="never"/>
+        <w:tblW w:w="2760" w:type="dxa"/>
+        <w:tblBorders>
+          <w:top w:val="none" w:sz="0" w:space="0" w:color="auto"/>
+          <w:left w:val="none" w:sz="0" w:space="0" w:color="auto"/>
+          <w:bottom w:val="none" w:sz="0" w:space="0" w:color="auto"/>
+          <w:right w:val="none" w:sz="0" w:space="0" w:color="auto"/>
+          <w:insideH w:val="none" w:sz="0" w:space="0" w:color="auto"/>
+          <w:insideV w:val="none" w:sz="0" w:space="0" w:color="auto"/>
+        </w:tblBorders>
+        <w:tblLook w:val="04A0" w:firstRow="1" w:lastRow="0" w:firstColumn="1" w:lastColumn="0" w:noHBand="0" w:noVBand="1"/>
+      </w:tblPr>
+      <w:tblGrid>
+        <w:gridCol w:w="2760"/>
+      </w:tblGrid>
+      <w:tr>
+        <w:trPr>
+          <w:trHeight w:val="349"/>
+        </w:trPr>
+        <w:tc>
+          <w:tcPr>
+            <w:tcW w:w="2760" w:type="dxa"/>
+            <w:vAlign w:val="center"/>
+          </w:tcPr>
+          <w:p>
+            <w:pPr>
+              <w:tabs>
+                <w:tab w:val="left" w:pos="2137"/>
+              </w:tabs>
+              <w:ind w:firstLine="0"/>
+              <w:jc w:val="center"/>
+              <w:rPr>
+                <w:sz w:val="20"/>
+                <w:szCs w:val="20"/>
+              </w:rPr>
+            </w:pPr>
+            <w:r>
+              <w:rPr>
+                <w:sz w:val="20"/>
+                <w:szCs w:val="20"/>
+              </w:rPr>
+              <w:t>REPUBLIC OF CAMEROUN</w:t>
+            </w:r>
+          </w:p>
+        </w:tc>
+      </w:tr>
+      <w:tr>
+        <w:trPr>
+          <w:trHeight w:val="349"/>
+        </w:trPr>
+        <w:tc>
+          <w:tcPr>
+            <w:tcW w:w="2760" w:type="dxa"/>
+            <w:vAlign w:val="center"/>
+          </w:tcPr>
+          <w:p>
+            <w:pPr>
+              <w:tabs>
+                <w:tab w:val="left" w:pos="2137"/>
+              </w:tabs>
+              <w:ind w:firstLine="0"/>
+              <w:jc w:val="center"/>
+              <w:rPr>
+                <w:sz w:val="20"/>
+                <w:szCs w:val="20"/>
+              </w:rPr>
+            </w:pPr>
+            <w:r>
+              <w:rPr>
+                <w:sz w:val="20"/>
+                <w:szCs w:val="20"/>
+              </w:rPr>
+              <w:t>*****</w:t>
+            </w:r>
+          </w:p>
+        </w:tc>
+      </w:tr>
+      <w:tr>
+        <w:trPr>
+          <w:trHeight w:val="349"/>
+        </w:trPr>
+        <w:tc>
+          <w:tcPr>
+            <w:tcW w:w="2760" w:type="dxa"/>
+            <w:vAlign w:val="center"/>
+          </w:tcPr>
+          <w:p>
+            <w:pPr>
+              <w:tabs>
+                <w:tab w:val="left" w:pos="2137"/>
+              </w:tabs>
+              <w:ind w:firstLine="0"/>
+              <w:jc w:val="center"/>
+              <w:rPr>
+                <w:sz w:val="20"/>
+                <w:szCs w:val="20"/>
+              </w:rPr>
+            </w:pPr>
+            <w:proofErr w:type="spellStart"/>
+            <w:r>
+              <w:rPr>
+                <w:sz w:val="20"/>
+                <w:szCs w:val="20"/>
+              </w:rPr>
+              <w:t>Peace-Work-Fatherland</w:t>
+            </w:r>
+            <w:proofErr w:type="spellEnd"/>
+          </w:p>
+        </w:tc>
+      </w:tr>
+    </w:tbl>
+    <w:p>
+      <w:pPr>
+        <w:rPr>
+          <w:sz w:val="48"/>
+          <w:szCs w:val="48"/>
+        </w:rPr>
+      </w:pPr>
+      <w:r>
+        <w:rPr>
+          <w:noProof/>
+          <w:lang w:val="en-US" w:eastAsia="en-US"/>
+        </w:rPr>
+        <w:drawing>
+          <wp:anchor distT="0" distB="0" distL="114300" distR="114300" simplePos="0" relativeHeight="251661312" behindDoc="0" locked="0" layoutInCell="1" allowOverlap="1" wp14:anchorId="4FEFE1ED" wp14:editId="40BB2547">
+            <wp:simplePos x="0" y="0"/>
+            <wp:positionH relativeFrom="margin">
+              <wp:align>center</wp:align>
+            </wp:positionH>
+            <wp:positionV relativeFrom="paragraph">
+              <wp:posOffset>671997</wp:posOffset>
+            </wp:positionV>
+            <wp:extent cx="2171700" cy="1028700"/>
+            <wp:effectExtent l="0" t="0" r="0" b="0"/>
+            <wp:wrapTopAndBottom/>
+            <wp:docPr id="1741345809" name="Image 2"/>
+            <wp:cNvGraphicFramePr>
+              <a:graphicFrameLocks xmlns:a="http://schemas.openxmlformats.org/drawingml/2006/main" noChangeAspect="1"/>
+            </wp:cNvGraphicFramePr>
+            <a:graphic xmlns:a="http://schemas.openxmlformats.org/drawingml/2006/main">
+              <a:graphicData uri="http://schemas.openxmlformats.org/drawingml/2006/picture">
+                <pic:pic xmlns:pic="http://schemas.openxmlformats.org/drawingml/2006/picture">
+                  <pic:nvPicPr>
+                    <pic:cNvPr id="1741345809" name="Image 1741345809"/>
+                    <pic:cNvPicPr/>
+                  </pic:nvPicPr>
+                  <pic:blipFill>
+                    <a:blip r:embed="rId7">
+                      <a:extLst>
+                        <a:ext uri="{28A0092B-C50C-407E-A947-70E740481C1C}">
+                          <a14:useLocalDpi xmlns:a14="http://schemas.microsoft.com/office/drawing/2010/main" val="0"/>
+                        </a:ext>
+                      </a:extLst>
+                    </a:blip>
+                    <a:stretch>
+                      <a:fillRect/>
+                    </a:stretch>
+                  </pic:blipFill>
+                  <pic:spPr>
+                    <a:xfrm>
+                      <a:off x="0" y="0"/>
+                      <a:ext cx="2171700" cy="1028700"/>
+                    </a:xfrm>
+                    <a:prstGeom prst="rect">
+                      <a:avLst/>
+                    </a:prstGeom>
+                  </pic:spPr>
+                </pic:pic>
+              </a:graphicData>
+            </a:graphic>
+          </wp:anchor>
+        </w:drawing>
+      </w:r>
+    </w:p>
+    <w:p>
+      <w:pPr>
+        <w:tabs>
+          <w:tab w:val="left" w:pos="3466"/>
+        </w:tabs>
         <w:rPr>
           <w:b/>
           <w:bCs/>
-          <w:color w:val="CC0000"/>
-          <w:sz w:val="28"/>
-          <w:szCs w:val="28"/>
-        </w:rPr>
-        <w:t>AFRILAND FIRST BANK</w:t>
-      </w:r>
-    </w:p>
-    <w:p>
-      <w:pPr>
-        <w:spacing w:after="80"/>
-        <w:jc w:val="center"/>
-      </w:pPr>
-      <w:r>
-        <w:rPr>
-          <w:color w:val="6B6B6B"/>
-        </w:rPr>
-        <w:t>Direction des Systèmes d'Information</w:t>
-      </w:r>
-    </w:p>
-    <w:p>
-      <w:pPr>
-        <w:spacing w:before="480" w:after="80"/>
-        <w:jc w:val="center"/>
+          <w:sz w:val="48"/>
+          <w:szCs w:val="48"/>
+        </w:rPr>
       </w:pPr>
       <w:r>
         <w:rPr>
           <w:b/>
           <w:bCs/>
-          <w:color w:val="1A1A1A"/>
-        </w:rPr>
-        <w:t>ASTYANN</w:t>
-      </w:r>
-    </w:p>
-    <w:p>
-      <w:pPr>
-        <w:spacing w:before="720" w:after="160"/>
+          <w:sz w:val="48"/>
+          <w:szCs w:val="48"/>
+        </w:rPr>
+        <w:tab/>
+      </w:r>
+    </w:p>
+    <w:p>
+      <w:pPr>
+        <w:tabs>
+          <w:tab w:val="left" w:pos="3466"/>
+        </w:tabs>
         <w:jc w:val="center"/>
-      </w:pPr>
-      <w:proofErr w:type="spellStart"/>
+        <w:rPr>
+          <w:bCs/>
+        </w:rPr>
+      </w:pPr>
       <w:r>
         <w:rPr>
           <w:b/>
           <w:bCs/>
-          <w:color w:val="1A1A1A"/>
-          <w:sz w:val="36"/>
-          <w:szCs w:val="36"/>
-        </w:rPr>
-        <w:t>Analysis</w:t>
-      </w:r>
-      <w:proofErr w:type="spellEnd"/>
+          <w:color w:val="EE0000"/>
+          <w:sz w:val="28"/>
+          <w:szCs w:val="40"/>
+        </w:rPr>
+        <w:t>AFRILAND FIRST BANK</w:t>
+      </w:r>
+    </w:p>
+    <w:p>
+      <w:pPr>
+        <w:tabs>
+          <w:tab w:val="left" w:pos="3466"/>
+        </w:tabs>
+        <w:jc w:val="center"/>
+      </w:pPr>
+      <w:r>
+        <w:t>Directions des Systèmes d’Information</w:t>
+      </w:r>
+    </w:p>
+    <w:p>
+      <w:pPr>
+        <w:tabs>
+          <w:tab w:val="left" w:pos="3466"/>
+        </w:tabs>
+      </w:pPr>
+    </w:p>
+    <w:p>
+      <w:pPr>
+        <w:tabs>
+          <w:tab w:val="left" w:pos="3466"/>
+        </w:tabs>
+        <w:jc w:val="center"/>
+        <w:rPr>
+          <w:b/>
+          <w:color w:val="0F4761" w:themeColor="accent1" w:themeShade="BF"/>
+          <w:sz w:val="40"/>
+          <w:szCs w:val="40"/>
+        </w:rPr>
+      </w:pPr>
       <w:r>
         <w:rPr>
           <w:b/>
           <w:bCs/>
-          <w:color w:val="1A1A1A"/>
+          <w:noProof/>
+          <w:sz w:val="48"/>
+          <w:szCs w:val="48"/>
+          <w:lang w:val="en-US" w:eastAsia="en-US"/>
+        </w:rPr>
+        <mc:AlternateContent>
+          <mc:Choice Requires="wps">
+            <w:drawing>
+              <wp:anchor distT="0" distB="0" distL="114300" distR="114300" simplePos="0" relativeHeight="251659264" behindDoc="0" locked="0" layoutInCell="1" allowOverlap="1" wp14:anchorId="6691E903" wp14:editId="06A4F83A">
+                <wp:simplePos x="0" y="0"/>
+                <wp:positionH relativeFrom="margin">
+                  <wp:align>center</wp:align>
+                </wp:positionH>
+                <wp:positionV relativeFrom="paragraph">
+                  <wp:posOffset>223654</wp:posOffset>
+                </wp:positionV>
+                <wp:extent cx="5262972" cy="4138"/>
+                <wp:effectExtent l="0" t="0" r="33020" b="34290"/>
+                <wp:wrapNone/>
+                <wp:docPr id="1021843831" name="Straight Connector 1"/>
+                <wp:cNvGraphicFramePr/>
+                <a:graphic xmlns:a="http://schemas.openxmlformats.org/drawingml/2006/main">
+                  <a:graphicData uri="http://schemas.microsoft.com/office/word/2010/wordprocessingShape">
+                    <wps:wsp>
+                      <wps:cNvCnPr/>
+                      <wps:spPr>
+                        <a:xfrm>
+                          <a:off x="0" y="0"/>
+                          <a:ext cx="5262972" cy="4138"/>
+                        </a:xfrm>
+                        <a:prstGeom prst="line">
+                          <a:avLst/>
+                        </a:prstGeom>
+                      </wps:spPr>
+                      <wps:style>
+                        <a:lnRef idx="1">
+                          <a:schemeClr val="dk1"/>
+                        </a:lnRef>
+                        <a:fillRef idx="0">
+                          <a:schemeClr val="dk1"/>
+                        </a:fillRef>
+                        <a:effectRef idx="0">
+                          <a:schemeClr val="dk1"/>
+                        </a:effectRef>
+                        <a:fontRef idx="minor">
+                          <a:schemeClr val="tx1"/>
+                        </a:fontRef>
+                      </wps:style>
+                      <wps:bodyPr/>
+                    </wps:wsp>
+                  </a:graphicData>
+                </a:graphic>
+                <wp14:sizeRelH relativeFrom="margin">
+                  <wp14:pctWidth>0</wp14:pctWidth>
+                </wp14:sizeRelH>
+                <wp14:sizeRelV relativeFrom="margin">
+                  <wp14:pctHeight>0</wp14:pctHeight>
+                </wp14:sizeRelV>
+              </wp:anchor>
+            </w:drawing>
+          </mc:Choice>
+          <mc:Fallback>
+            <w:pict>
+              <v:line w14:anchorId="03183B67" id="Straight Connector 1" o:spid="_x0000_s1026" style="position:absolute;z-index:251659264;visibility:visible;mso-wrap-style:square;mso-width-percent:0;mso-height-percent:0;mso-wrap-distance-left:9pt;mso-wrap-distance-top:0;mso-wrap-distance-right:9pt;mso-wrap-distance-bottom:0;mso-position-horizontal:center;mso-position-horizontal-relative:margin;mso-position-vertical:absolute;mso-position-vertical-relative:text;mso-width-percent:0;mso-height-percent:0;mso-width-relative:margin;mso-height-relative:margin" from="0,17.6pt" to="414.4pt,17.95pt" o:gfxdata="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" strokecolor="black [3200]" strokeweight="1pt">
+                <v:stroke joinstyle="miter"/>
+                <w10:wrap anchorx="margin"/>
+              </v:line>
+            </w:pict>
+          </mc:Fallback>
+        </mc:AlternateContent>
+      </w:r>
+    </w:p>
+    <w:p>
+      <w:pPr>
+        <w:tabs>
+          <w:tab w:val="left" w:pos="3466"/>
+        </w:tabs>
+        <w:jc w:val="center"/>
+        <w:rPr>
+          <w:b/>
+          <w:color w:val="215E99" w:themeColor="text2" w:themeTint="BF"/>
           <w:sz w:val="36"/>
-          <w:szCs w:val="36"/>
+          <w:szCs w:val="48"/>
+        </w:rPr>
+      </w:pPr>
+      <w:bookmarkStart w:id="0" w:name="_GoBack"/>
+      <w:proofErr w:type="spellStart"/>
+      <w:r>
+        <w:rPr>
+          <w:b/>
+          <w:color w:val="215E99" w:themeColor="text2" w:themeTint="BF"/>
+          <w:sz w:val="40"/>
+          <w:szCs w:val="52"/>
+        </w:rPr>
+        <w:t>Analysis</w:t>
+      </w:r>
+      <w:proofErr w:type="spellEnd"/>
+      <w:r>
+        <w:rPr>
+          <w:b/>
+          <w:color w:val="215E99" w:themeColor="text2" w:themeTint="BF"/>
+          <w:sz w:val="40"/>
+          <w:szCs w:val="52"/>
         </w:rPr>
         <w:t xml:space="preserve"> Document</w:t>
       </w:r>
     </w:p>
-    <w:p>
-      <w:pPr>
-        <w:spacing w:after="480"/>
+    <w:bookmarkEnd w:id="0"/>
+    <w:p>
+      <w:pPr>
+        <w:tabs>
+          <w:tab w:val="left" w:pos="3466"/>
+        </w:tabs>
         <w:jc w:val="center"/>
-      </w:pPr>
+        <w:rPr>
+          <w:b/>
+          <w:color w:val="0F4761" w:themeColor="accent1" w:themeShade="BF"/>
+          <w:sz w:val="36"/>
+          <w:szCs w:val="48"/>
+        </w:rPr>
+      </w:pPr>
+      <w:r>
+        <w:rPr>
+          <w:b/>
+          <w:bCs/>
+          <w:noProof/>
+          <w:sz w:val="48"/>
+          <w:szCs w:val="48"/>
+          <w:lang w:val="en-US" w:eastAsia="en-US"/>
+        </w:rPr>
+        <mc:AlternateContent>
+          <mc:Choice Requires="wps">
+            <w:drawing>
+              <wp:anchor distT="0" distB="0" distL="114300" distR="114300" simplePos="0" relativeHeight="251660288" behindDoc="0" locked="0" layoutInCell="1" allowOverlap="1" wp14:anchorId="01D37E46" wp14:editId="7A7867A9">
+                <wp:simplePos x="0" y="0"/>
+                <wp:positionH relativeFrom="margin">
+                  <wp:align>center</wp:align>
+                </wp:positionH>
+                <wp:positionV relativeFrom="paragraph">
+                  <wp:posOffset>241935</wp:posOffset>
+                </wp:positionV>
+                <wp:extent cx="5262972" cy="4138"/>
+                <wp:effectExtent l="0" t="0" r="33020" b="34290"/>
+                <wp:wrapNone/>
+                <wp:docPr id="1605822955" name="Straight Connector 1"/>
+                <wp:cNvGraphicFramePr/>
+                <a:graphic xmlns:a="http://schemas.openxmlformats.org/drawingml/2006/main">
+                  <a:graphicData uri="http://schemas.microsoft.com/office/word/2010/wordprocessingShape">
+                    <wps:wsp>
+                      <wps:cNvCnPr/>
+                      <wps:spPr>
+                        <a:xfrm>
+                          <a:off x="0" y="0"/>
+                          <a:ext cx="5262972" cy="4138"/>
+                        </a:xfrm>
+                        <a:prstGeom prst="line">
+                          <a:avLst/>
+                        </a:prstGeom>
+                      </wps:spPr>
+                      <wps:style>
+                        <a:lnRef idx="1">
+                          <a:schemeClr val="dk1"/>
+                        </a:lnRef>
+                        <a:fillRef idx="0">
+                          <a:schemeClr val="dk1"/>
+                        </a:fillRef>
+                        <a:effectRef idx="0">
+                          <a:schemeClr val="dk1"/>
+                        </a:effectRef>
+                        <a:fontRef idx="minor">
+                          <a:schemeClr val="tx1"/>
+                        </a:fontRef>
+                      </wps:style>
+                      <wps:bodyPr/>
+                    </wps:wsp>
+                  </a:graphicData>
+                </a:graphic>
+                <wp14:sizeRelH relativeFrom="margin">
+                  <wp14:pctWidth>0</wp14:pctWidth>
+                </wp14:sizeRelH>
+                <wp14:sizeRelV relativeFrom="margin">
+                  <wp14:pctHeight>0</wp14:pctHeight>
+                </wp14:sizeRelV>
+              </wp:anchor>
+            </w:drawing>
+          </mc:Choice>
+          <mc:Fallback>
+            <w:pict>
+              <v:line w14:anchorId="7D6C1ABD" id="Straight Connector 1" o:spid="_x0000_s1026" style="position:absolute;z-index:251660288;visibility:visible;mso-wrap-style:square;mso-width-percent:0;mso-height-percent:0;mso-wrap-distance-left:9pt;mso-wrap-distance-top:0;mso-wrap-distance-right:9pt;mso-wrap-distance-bottom:0;mso-position-horizontal:center;mso-position-horizontal-relative:margin;mso-position-vertical:absolute;mso-position-vertical-relative:text;mso-width-percent:0;mso-height-percent:0;mso-width-relative:margin;mso-height-relative:margin" from="0,19.05pt" to="414.4pt,19.4pt" o:gfxdata="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" strokecolor="black [3200]" strokeweight="1pt">
+                <v:stroke joinstyle="miter"/>
+                <w10:wrap anchorx="margin"/>
+              </v:line>
+            </w:pict>
+          </mc:Fallback>
+        </mc:AlternateContent>
+      </w:r>
       <w:r>
         <w:rPr>
           <w:i/>
           <w:iCs/>
           <w:color w:val="6B6B6B"/>
-        </w:rPr>
-        <w:t>Cahier d'Analyse</w:t>
-      </w:r>
+          <w:lang w:val="en-US"/>
+        </w:rPr>
+        <w:t xml:space="preserve">Cahier </w:t>
+      </w:r>
+      <w:proofErr w:type="spellStart"/>
+      <w:r>
+        <w:rPr>
+          <w:i/>
+          <w:iCs/>
+          <w:color w:val="6B6B6B"/>
+          <w:lang w:val="en-US"/>
+        </w:rPr>
+        <w:t>d'Analyse</w:t>
+      </w:r>
+      <w:proofErr w:type="spellEnd"/>
     </w:p>
     <w:p>
       <w:pPr>
         <w:spacing w:before="360" w:after="80"/>
         <w:jc w:val="center"/>
+        <w:rPr>
+          <w:lang w:val="en-US"/>
+        </w:rPr>
       </w:pPr>
       <w:r>
         <w:rPr>
@@ -97,6 +601,7 @@
           <w:bCs/>
           <w:sz w:val="28"/>
           <w:szCs w:val="28"/>
+          <w:lang w:val="en-US"/>
         </w:rPr>
         <w:t>${project.name}</w:t>
       </w:r>
@@ -105,26 +610,30 @@
       <w:pPr>
         <w:spacing w:after="80"/>
         <w:jc w:val="center"/>
+        <w:rPr>
+          <w:lang w:val="en-US"/>
+        </w:rPr>
       </w:pPr>
       <w:r>
         <w:rPr>
           <w:color w:val="6B6B6B"/>
+          <w:lang w:val="en-US"/>
         </w:rPr>
         <w:t>${</w:t>
       </w:r>
       <w:proofErr w:type="spellStart"/>
-      <w:proofErr w:type="gramStart"/>
       <w:r>
         <w:rPr>
           <w:color w:val="6B6B6B"/>
+          <w:lang w:val="en-US"/>
         </w:rPr>
         <w:t>project.organisationName</w:t>
       </w:r>
       <w:proofErr w:type="spellEnd"/>
-      <w:proofErr w:type="gramEnd"/>
       <w:r>
         <w:rPr>
           <w:color w:val="6B6B6B"/>
+          <w:lang w:val="en-US"/>
         </w:rPr>
         <w:t>}</w:t>
       </w:r>
@@ -133,66 +642,84 @@
       <w:pPr>
         <w:spacing w:after="80"/>
         <w:jc w:val="center"/>
+        <w:rPr>
+          <w:lang w:val="en-US"/>
+        </w:rPr>
       </w:pPr>
       <w:r>
         <w:rPr>
           <w:color w:val="6B6B6B"/>
           <w:sz w:val="20"/>
           <w:szCs w:val="20"/>
+          <w:lang w:val="en-US"/>
         </w:rPr>
         <w:t>Version ${</w:t>
       </w:r>
       <w:proofErr w:type="spellStart"/>
-      <w:proofErr w:type="gramStart"/>
       <w:r>
         <w:rPr>
           <w:color w:val="6B6B6B"/>
           <w:sz w:val="20"/>
           <w:szCs w:val="20"/>
+          <w:lang w:val="en-US"/>
         </w:rPr>
         <w:t>project.version</w:t>
       </w:r>
       <w:proofErr w:type="spellEnd"/>
-      <w:proofErr w:type="gramEnd"/>
       <w:r>
         <w:rPr>
           <w:color w:val="6B6B6B"/>
           <w:sz w:val="20"/>
           <w:szCs w:val="20"/>
+          <w:lang w:val="en-US"/>
         </w:rPr>
         <w:t>} | ${</w:t>
       </w:r>
       <w:proofErr w:type="spellStart"/>
-      <w:proofErr w:type="gramStart"/>
       <w:r>
         <w:rPr>
           <w:color w:val="6B6B6B"/>
           <w:sz w:val="20"/>
           <w:szCs w:val="20"/>
+          <w:lang w:val="en-US"/>
         </w:rPr>
         <w:t>project.date</w:t>
       </w:r>
       <w:proofErr w:type="spellEnd"/>
-      <w:proofErr w:type="gramEnd"/>
       <w:r>
         <w:rPr>
           <w:color w:val="6B6B6B"/>
           <w:sz w:val="20"/>
           <w:szCs w:val="20"/>
+          <w:lang w:val="en-US"/>
         </w:rPr>
         <w:t>}</w:t>
       </w:r>
     </w:p>
     <w:p>
-      <w:r>
+      <w:pPr>
+        <w:rPr>
+          <w:lang w:val="en-US"/>
+        </w:rPr>
+      </w:pPr>
+      <w:r>
+        <w:rPr>
+          <w:lang w:val="en-US"/>
+        </w:rPr>
         <w:br w:type="page"/>
       </w:r>
     </w:p>
     <w:p>
       <w:pPr>
         <w:pStyle w:val="Heading1"/>
-      </w:pPr>
-      <w:r>
+        <w:rPr>
+          <w:lang w:val="en-US"/>
+        </w:rPr>
+      </w:pPr>
+      <w:r>
+        <w:rPr>
+          <w:lang w:val="en-US"/>
+        </w:rPr>
         <w:lastRenderedPageBreak/>
         <w:t>1. Introduction</w:t>
       </w:r>
@@ -202,10 +729,14 @@
         <w:spacing w:after="120" w:line="276" w:lineRule="auto"/>
         <w:ind w:firstLine="567"/>
         <w:jc w:val="both"/>
+        <w:rPr>
+          <w:lang w:val="en-US"/>
+        </w:rPr>
       </w:pPr>
       <w:r>
         <w:rPr>
           <w:color w:val="1A1A1A"/>
+          <w:lang w:val="en-US"/>
         </w:rPr>
         <w:t>${introduction}</w:t>
       </w:r>
@@ -213,49 +744,53 @@
     <w:p>
       <w:pPr>
         <w:spacing w:after="120"/>
+        <w:rPr>
+          <w:lang w:val="en-US"/>
+        </w:rPr>
       </w:pPr>
     </w:p>
     <w:p>
       <w:pPr>
         <w:pStyle w:val="Heading1"/>
-      </w:pPr>
-      <w:r>
-        <w:t xml:space="preserve">2. Project </w:t>
-      </w:r>
-      <w:proofErr w:type="spellStart"/>
-      <w:r>
-        <w:t>Presentation</w:t>
-      </w:r>
-      <w:proofErr w:type="spellEnd"/>
+        <w:rPr>
+          <w:lang w:val="en-US"/>
+        </w:rPr>
+      </w:pPr>
+      <w:r>
+        <w:rPr>
+          <w:lang w:val="en-US"/>
+        </w:rPr>
+        <w:t>2. Project Presentation</w:t>
+      </w:r>
     </w:p>
     <w:p>
       <w:pPr>
         <w:pStyle w:val="Heading2"/>
+        <w:rPr>
+          <w:lang w:val="en-US"/>
+        </w:rPr>
       </w:pPr>
       <w:r>
         <w:rPr>
           <w:u w:val="single"/>
-        </w:rPr>
-        <w:t xml:space="preserve">2.1.1 General Project </w:t>
-      </w:r>
-      <w:proofErr w:type="spellStart"/>
-      <w:r>
-        <w:rPr>
-          <w:u w:val="single"/>
-        </w:rPr>
-        <w:t>Presentation</w:t>
-      </w:r>
-      <w:proofErr w:type="spellEnd"/>
+          <w:lang w:val="en-US"/>
+        </w:rPr>
+        <w:t>2.1.1 General Project Presentation</w:t>
+      </w:r>
     </w:p>
     <w:p>
       <w:pPr>
         <w:spacing w:after="120" w:line="276" w:lineRule="auto"/>
         <w:ind w:firstLine="567"/>
         <w:jc w:val="both"/>
+        <w:rPr>
+          <w:lang w:val="en-US"/>
+        </w:rPr>
       </w:pPr>
       <w:r>
         <w:rPr>
           <w:color w:val="1A1A1A"/>
+          <w:lang w:val="en-US"/>
         </w:rPr>
         <w:t>${</w:t>
       </w:r>
@@ -263,6 +798,7 @@
       <w:r>
         <w:rPr>
           <w:color w:val="1A1A1A"/>
+          <w:lang w:val="en-US"/>
         </w:rPr>
         <w:t>projectPresentation.generalPresentation</w:t>
       </w:r>
@@ -270,6 +806,7 @@
       <w:r>
         <w:rPr>
           <w:color w:val="1A1A1A"/>
+          <w:lang w:val="en-US"/>
         </w:rPr>
         <w:t>}</w:t>
       </w:r>
@@ -277,36 +814,39 @@
     <w:p>
       <w:pPr>
         <w:spacing w:after="120"/>
+        <w:rPr>
+          <w:lang w:val="en-US"/>
+        </w:rPr>
       </w:pPr>
     </w:p>
     <w:p>
       <w:pPr>
         <w:pStyle w:val="Heading2"/>
+        <w:rPr>
+          <w:lang w:val="en-US"/>
+        </w:rPr>
       </w:pPr>
       <w:r>
         <w:rPr>
           <w:u w:val="single"/>
-        </w:rPr>
-        <w:t xml:space="preserve">2.1.2 Project </w:t>
-      </w:r>
-      <w:proofErr w:type="spellStart"/>
-      <w:r>
-        <w:rPr>
-          <w:u w:val="single"/>
-        </w:rPr>
-        <w:t>Context</w:t>
-      </w:r>
-      <w:proofErr w:type="spellEnd"/>
+          <w:lang w:val="en-US"/>
+        </w:rPr>
+        <w:t>2.1.2 Project Context</w:t>
+      </w:r>
     </w:p>
     <w:p>
       <w:pPr>
         <w:spacing w:after="120" w:line="276" w:lineRule="auto"/>
         <w:ind w:firstLine="567"/>
         <w:jc w:val="both"/>
+        <w:rPr>
+          <w:lang w:val="en-US"/>
+        </w:rPr>
       </w:pPr>
       <w:r>
         <w:rPr>
           <w:color w:val="1A1A1A"/>
+          <w:lang w:val="en-US"/>
         </w:rPr>
         <w:t>${</w:t>
       </w:r>
@@ -314,6 +854,7 @@
       <w:r>
         <w:rPr>
           <w:color w:val="1A1A1A"/>
+          <w:lang w:val="en-US"/>
         </w:rPr>
         <w:t>projectPresentation.projectContext</w:t>
       </w:r>
@@ -321,6 +862,7 @@
       <w:r>
         <w:rPr>
           <w:color w:val="1A1A1A"/>
+          <w:lang w:val="en-US"/>
         </w:rPr>
         <w:t>}</w:t>
       </w:r>
@@ -328,6 +870,9 @@
     <w:p>
       <w:pPr>
         <w:spacing w:after="120"/>
+        <w:rPr>
+          <w:lang w:val="en-US"/>
+        </w:rPr>
       </w:pPr>
     </w:p>
     <w:p>
@@ -395,12 +940,6 @@
         <w:gridCol w:w="8438"/>
       </w:tblGrid>
       <w:tr>
-        <w:tblPrEx>
-          <w:tblCellMar>
-            <w:top w:w="0" w:type="dxa"/>
-            <w:bottom w:w="0" w:type="dxa"/>
-          </w:tblCellMar>
-        </w:tblPrEx>
         <w:trPr>
           <w:tblHeader/>
         </w:trPr>
@@ -456,12 +995,6 @@
         </w:tc>
       </w:tr>
       <w:tr>
-        <w:tblPrEx>
-          <w:tblCellMar>
-            <w:top w:w="0" w:type="dxa"/>
-            <w:bottom w:w="0" w:type="dxa"/>
-          </w:tblCellMar>
-        </w:tblPrEx>
         <w:tc>
           <w:tcPr>
             <w:tcW w:w="1200" w:type="dxa"/>
@@ -501,7 +1034,6 @@
               <w:t>${</w:t>
             </w:r>
             <w:proofErr w:type="spellStart"/>
-            <w:proofErr w:type="gramStart"/>
             <w:r>
               <w:rPr>
                 <w:sz w:val="20"/>
@@ -510,7 +1042,6 @@
               <w:t>fr.description</w:t>
             </w:r>
             <w:proofErr w:type="spellEnd"/>
-            <w:proofErr w:type="gramEnd"/>
             <w:r>
               <w:rPr>
                 <w:sz w:val="20"/>
@@ -570,12 +1101,6 @@
         <w:gridCol w:w="8438"/>
       </w:tblGrid>
       <w:tr>
-        <w:tblPrEx>
-          <w:tblCellMar>
-            <w:top w:w="0" w:type="dxa"/>
-            <w:bottom w:w="0" w:type="dxa"/>
-          </w:tblCellMar>
-        </w:tblPrEx>
         <w:trPr>
           <w:tblHeader/>
         </w:trPr>
@@ -631,12 +1156,6 @@
         </w:tc>
       </w:tr>
       <w:tr>
-        <w:tblPrEx>
-          <w:tblCellMar>
-            <w:top w:w="0" w:type="dxa"/>
-            <w:bottom w:w="0" w:type="dxa"/>
-          </w:tblCellMar>
-        </w:tblPrEx>
         <w:tc>
           <w:tcPr>
             <w:tcW w:w="1200" w:type="dxa"/>
@@ -676,7 +1195,6 @@
               <w:t>${</w:t>
             </w:r>
             <w:proofErr w:type="spellStart"/>
-            <w:proofErr w:type="gramStart"/>
             <w:r>
               <w:rPr>
                 <w:sz w:val="20"/>
@@ -685,7 +1203,6 @@
               <w:t>nfr.description</w:t>
             </w:r>
             <w:proofErr w:type="spellEnd"/>
-            <w:proofErr w:type="gramEnd"/>
             <w:r>
               <w:rPr>
                 <w:sz w:val="20"/>
@@ -773,12 +1290,6 @@
         <w:gridCol w:w="6638"/>
       </w:tblGrid>
       <w:tr>
-        <w:tblPrEx>
-          <w:tblCellMar>
-            <w:top w:w="0" w:type="dxa"/>
-            <w:bottom w:w="0" w:type="dxa"/>
-          </w:tblCellMar>
-        </w:tblPrEx>
         <w:trPr>
           <w:tblHeader/>
         </w:trPr>
@@ -836,12 +1347,6 @@
         </w:tc>
       </w:tr>
       <w:tr>
-        <w:tblPrEx>
-          <w:tblCellMar>
-            <w:top w:w="0" w:type="dxa"/>
-            <w:bottom w:w="0" w:type="dxa"/>
-          </w:tblCellMar>
-        </w:tblPrEx>
         <w:tc>
           <w:tcPr>
             <w:tcW w:w="3000" w:type="dxa"/>
@@ -943,12 +1448,6 @@
         <w:gridCol w:w="6638"/>
       </w:tblGrid>
       <w:tr>
-        <w:tblPrEx>
-          <w:tblCellMar>
-            <w:top w:w="0" w:type="dxa"/>
-            <w:bottom w:w="0" w:type="dxa"/>
-          </w:tblCellMar>
-        </w:tblPrEx>
         <w:trPr>
           <w:tblHeader/>
         </w:trPr>
@@ -1006,12 +1505,6 @@
         </w:tc>
       </w:tr>
       <w:tr>
-        <w:tblPrEx>
-          <w:tblCellMar>
-            <w:top w:w="0" w:type="dxa"/>
-            <w:bottom w:w="0" w:type="dxa"/>
-          </w:tblCellMar>
-        </w:tblPrEx>
         <w:tc>
           <w:tcPr>
             <w:tcW w:w="3000" w:type="dxa"/>
@@ -1158,12 +1651,6 @@
         <w:gridCol w:w="7438"/>
       </w:tblGrid>
       <w:tr>
-        <w:tblPrEx>
-          <w:tblCellMar>
-            <w:top w:w="0" w:type="dxa"/>
-            <w:bottom w:w="0" w:type="dxa"/>
-          </w:tblCellMar>
-        </w:tblPrEx>
         <w:trPr>
           <w:tblHeader/>
         </w:trPr>
@@ -1219,12 +1706,6 @@
         </w:tc>
       </w:tr>
       <w:tr>
-        <w:tblPrEx>
-          <w:tblCellMar>
-            <w:top w:w="0" w:type="dxa"/>
-            <w:bottom w:w="0" w:type="dxa"/>
-          </w:tblCellMar>
-        </w:tblPrEx>
         <w:tc>
           <w:tcPr>
             <w:tcW w:w="2200" w:type="dxa"/>
@@ -1267,7 +1748,6 @@
               <w:t>${</w:t>
             </w:r>
             <w:proofErr w:type="spellStart"/>
-            <w:proofErr w:type="gramStart"/>
             <w:r>
               <w:rPr>
                 <w:sz w:val="20"/>
@@ -1276,7 +1756,6 @@
               <w:t>uc.title</w:t>
             </w:r>
             <w:proofErr w:type="spellEnd"/>
-            <w:proofErr w:type="gramEnd"/>
             <w:r>
               <w:rPr>
                 <w:sz w:val="20"/>
@@ -1288,12 +1767,6 @@
         </w:tc>
       </w:tr>
       <w:tr>
-        <w:tblPrEx>
-          <w:tblCellMar>
-            <w:top w:w="0" w:type="dxa"/>
-            <w:bottom w:w="0" w:type="dxa"/>
-          </w:tblCellMar>
-        </w:tblPrEx>
         <w:tc>
           <w:tcPr>
             <w:tcW w:w="2200" w:type="dxa"/>
@@ -1336,7 +1809,6 @@
               <w:t>${</w:t>
             </w:r>
             <w:proofErr w:type="spellStart"/>
-            <w:proofErr w:type="gramStart"/>
             <w:r>
               <w:rPr>
                 <w:sz w:val="20"/>
@@ -1345,7 +1817,6 @@
               <w:t>uc.objective</w:t>
             </w:r>
             <w:proofErr w:type="spellEnd"/>
-            <w:proofErr w:type="gramEnd"/>
             <w:r>
               <w:rPr>
                 <w:sz w:val="20"/>
@@ -1357,12 +1828,6 @@
         </w:tc>
       </w:tr>
       <w:tr>
-        <w:tblPrEx>
-          <w:tblCellMar>
-            <w:top w:w="0" w:type="dxa"/>
-            <w:bottom w:w="0" w:type="dxa"/>
-          </w:tblCellMar>
-        </w:tblPrEx>
         <w:tc>
           <w:tcPr>
             <w:tcW w:w="2200" w:type="dxa"/>
@@ -1405,7 +1870,6 @@
               <w:t>${</w:t>
             </w:r>
             <w:proofErr w:type="spellStart"/>
-            <w:proofErr w:type="gramStart"/>
             <w:r>
               <w:rPr>
                 <w:sz w:val="20"/>
@@ -1414,7 +1878,6 @@
               <w:t>uc.actors</w:t>
             </w:r>
             <w:proofErr w:type="spellEnd"/>
-            <w:proofErr w:type="gramEnd"/>
             <w:r>
               <w:rPr>
                 <w:sz w:val="20"/>
@@ -1426,12 +1889,6 @@
         </w:tc>
       </w:tr>
       <w:tr>
-        <w:tblPrEx>
-          <w:tblCellMar>
-            <w:top w:w="0" w:type="dxa"/>
-            <w:bottom w:w="0" w:type="dxa"/>
-          </w:tblCellMar>
-        </w:tblPrEx>
         <w:tc>
           <w:tcPr>
             <w:tcW w:w="2200" w:type="dxa"/>
@@ -1476,7 +1933,6 @@
               <w:t>${</w:t>
             </w:r>
             <w:proofErr w:type="spellStart"/>
-            <w:proofErr w:type="gramStart"/>
             <w:r>
               <w:rPr>
                 <w:sz w:val="20"/>
@@ -1485,7 +1941,6 @@
               <w:t>uc.preconditions</w:t>
             </w:r>
             <w:proofErr w:type="spellEnd"/>
-            <w:proofErr w:type="gramEnd"/>
             <w:r>
               <w:rPr>
                 <w:sz w:val="20"/>
@@ -1497,12 +1952,6 @@
         </w:tc>
       </w:tr>
       <w:tr>
-        <w:tblPrEx>
-          <w:tblCellMar>
-            <w:top w:w="0" w:type="dxa"/>
-            <w:bottom w:w="0" w:type="dxa"/>
-          </w:tblCellMar>
-        </w:tblPrEx>
         <w:tc>
           <w:tcPr>
             <w:tcW w:w="2200" w:type="dxa"/>
@@ -1545,7 +1994,6 @@
               <w:t>${</w:t>
             </w:r>
             <w:proofErr w:type="spellStart"/>
-            <w:proofErr w:type="gramStart"/>
             <w:r>
               <w:rPr>
                 <w:sz w:val="20"/>
@@ -1554,7 +2002,6 @@
               <w:t>uc.postconditions</w:t>
             </w:r>
             <w:proofErr w:type="spellEnd"/>
-            <w:proofErr w:type="gramEnd"/>
             <w:r>
               <w:rPr>
                 <w:sz w:val="20"/>
@@ -1566,12 +2013,6 @@
         </w:tc>
       </w:tr>
       <w:tr>
-        <w:tblPrEx>
-          <w:tblCellMar>
-            <w:top w:w="0" w:type="dxa"/>
-            <w:bottom w:w="0" w:type="dxa"/>
-          </w:tblCellMar>
-        </w:tblPrEx>
         <w:tc>
           <w:tcPr>
             <w:tcW w:w="2200" w:type="dxa"/>
@@ -1616,7 +2057,6 @@
               <w:t>${</w:t>
             </w:r>
             <w:proofErr w:type="spellStart"/>
-            <w:proofErr w:type="gramStart"/>
             <w:r>
               <w:rPr>
                 <w:sz w:val="20"/>
@@ -1625,7 +2065,6 @@
               <w:t>uc.mainScenario</w:t>
             </w:r>
             <w:proofErr w:type="spellEnd"/>
-            <w:proofErr w:type="gramEnd"/>
             <w:r>
               <w:rPr>
                 <w:sz w:val="20"/>
@@ -1637,12 +2076,6 @@
         </w:tc>
       </w:tr>
       <w:tr>
-        <w:tblPrEx>
-          <w:tblCellMar>
-            <w:top w:w="0" w:type="dxa"/>
-            <w:bottom w:w="0" w:type="dxa"/>
-          </w:tblCellMar>
-        </w:tblPrEx>
         <w:tc>
           <w:tcPr>
             <w:tcW w:w="2200" w:type="dxa"/>
@@ -1687,7 +2120,6 @@
               <w:t>${</w:t>
             </w:r>
             <w:proofErr w:type="spellStart"/>
-            <w:proofErr w:type="gramStart"/>
             <w:r>
               <w:rPr>
                 <w:sz w:val="20"/>
@@ -1696,7 +2128,6 @@
               <w:t>uc.alternativeScenario</w:t>
             </w:r>
             <w:proofErr w:type="spellEnd"/>
-            <w:proofErr w:type="gramEnd"/>
             <w:r>
               <w:rPr>
                 <w:sz w:val="20"/>
@@ -1764,12 +2195,6 @@
         <w:gridCol w:w="3569"/>
       </w:tblGrid>
       <w:tr>
-        <w:tblPrEx>
-          <w:tblCellMar>
-            <w:top w:w="0" w:type="dxa"/>
-            <w:bottom w:w="0" w:type="dxa"/>
-          </w:tblCellMar>
-        </w:tblPrEx>
         <w:trPr>
           <w:tblHeader/>
         </w:trPr>
@@ -1854,12 +2279,6 @@
         </w:tc>
       </w:tr>
       <w:tr>
-        <w:tblPrEx>
-          <w:tblCellMar>
-            <w:top w:w="0" w:type="dxa"/>
-            <w:bottom w:w="0" w:type="dxa"/>
-          </w:tblCellMar>
-        </w:tblPrEx>
         <w:tc>
           <w:tcPr>
             <w:tcW w:w="2500" w:type="dxa"/>
@@ -1899,7 +2318,6 @@
               <w:t>${</w:t>
             </w:r>
             <w:proofErr w:type="spellStart"/>
-            <w:proofErr w:type="gramStart"/>
             <w:r>
               <w:rPr>
                 <w:sz w:val="20"/>
@@ -1908,7 +2326,6 @@
               <w:t>entity.attributes</w:t>
             </w:r>
             <w:proofErr w:type="spellEnd"/>
-            <w:proofErr w:type="gramEnd"/>
             <w:r>
               <w:rPr>
                 <w:sz w:val="20"/>
@@ -1937,7 +2354,6 @@
               <w:t>${</w:t>
             </w:r>
             <w:proofErr w:type="spellStart"/>
-            <w:proofErr w:type="gramStart"/>
             <w:r>
               <w:rPr>
                 <w:sz w:val="20"/>
@@ -1946,7 +2362,6 @@
               <w:t>entity.methods</w:t>
             </w:r>
             <w:proofErr w:type="spellEnd"/>
-            <w:proofErr w:type="gramEnd"/>
             <w:r>
               <w:rPr>
                 <w:sz w:val="20"/>
@@ -2100,7 +2515,7 @@
       </w:r>
     </w:p>
     <w:sectPr>
-      <w:footerReference w:type="default" r:id="rId7"/>
+      <w:footerReference w:type="default" r:id="rId8"/>
       <w:pgSz w:w="11906" w:h="16838"/>
       <w:pgMar w:top="1134" w:right="1134" w:bottom="1134" w:left="1134" w:header="708" w:footer="708" w:gutter="0"/>
       <w:cols w:space="720"/>
@@ -2111,7 +2526,7 @@
 </file>
 
 <file path=word/endnotes.xml><?xml version="1.0" encoding="utf-8"?>
-<w:endnotes xmlns:wpc="http://schemas.microsoft.com/office/word/2010/wordprocessingCanvas" xmlns:cx="http://schemas.microsoft.com/office/drawing/2014/chartex" xmlns:cx1="http://schemas.microsoft.com/office/drawing/2015/9/8/chartex" xmlns:cx2="http://schemas.microsoft.com/office/drawing/2015/10/21/chartex" xmlns:cx3="http://schemas.microsoft.com/office/drawing/2016/5/9/chartex" xmlns:cx4="http://schemas.microsoft.com/office/drawing/2016/5/10/chartex" xmlns:cx5="http://schemas.microsoft.com/office/drawing/2016/5/11/chartex" xmlns:cx6="http://schemas.microsoft.com/office/drawing/2016/5/12/chartex" xmlns:cx7="http://schemas.microsoft.com/office/drawing/2016/5/13/chartex" xmlns:cx8="http://schemas.microsoft.com/office/drawing/2016/5/14/chartex" xmlns:mc="http://schemas.openxmlformats.org/markup-compatibility/2006" xmlns:aink="http://schemas.microsoft.com/office/drawing/2016/ink" xmlns:am3d="http://schemas.microsoft.com/office/drawing/2017/model3d" xmlns:o="urn:schemas-microsoft-com:office:office" xmlns:oel="http://schemas.microsoft.com/office/2019/extlst" xmlns:r="http://schemas.openxmlformats.org/officeDocument/2006/relationships" xmlns:m="http://schemas.openxmlformats.org/officeDocument/2006/math" xmlns:v="urn:schemas-microsoft-com:vml" xmlns:wp14="http://schemas.microsoft.com/office/word/2010/wordprocessingDrawing" xmlns:wp="http://schemas.openxmlformats.org/drawingml/2006/wordprocessingDrawing" xmlns:w10="urn:schemas-microsoft-com:office:word" xmlns:w="http://schemas.openxmlformats.org/wordprocessingml/2006/main" xmlns:w14="http://schemas.microsoft.com/office/word/2010/wordml" xmlns:w15="http://schemas.microsoft.com/office/word/2012/wordml" xmlns:w16cex="http://schemas.microsoft.com/office/word/2018/wordml/cex" xmlns:w16cid="http://schemas.microsoft.com/office/word/2016/wordml/cid" xmlns:w16="http://schemas.microsoft.com/office/word/2018/wordml" xmlns:w16du="http://schemas.microsoft.com/office/word/2023/wordml/word16du" xmlns:w16sdtdh="http://schemas.microsoft.com/office/word/2020/wordml/sdtdatahash" xmlns:w16sdtfl="http://schemas.microsoft.com/office/word/2024/wordml/sdtformatlock" xmlns:w16se="http://schemas.microsoft.com/office/word/2015/wordml/symex" xmlns:wpg="http://schemas.microsoft.com/office/word/2010/wordprocessingGroup" xmlns:wpi="http://schemas.microsoft.com/office/word/2010/wordprocessingInk" xmlns:wne="http://schemas.microsoft.com/office/word/2006/wordml" xmlns:wps="http://schemas.microsoft.com/office/word/2010/wordprocessingShape" mc:Ignorable="w14 w15 w16se w16cid w16 w16cex w16sdtdh w16sdtfl w16du wp14">
+<w:endnotes xmlns:wpc="http://schemas.microsoft.com/office/word/2010/wordprocessingCanvas" xmlns:cx="http://schemas.microsoft.com/office/drawing/2014/chartex" xmlns:cx1="http://schemas.microsoft.com/office/drawing/2015/9/8/chartex" xmlns:mc="http://schemas.openxmlformats.org/markup-compatibility/2006" xmlns:o="urn:schemas-microsoft-com:office:office" xmlns:r="http://schemas.openxmlformats.org/officeDocument/2006/relationships" xmlns:m="http://schemas.openxmlformats.org/officeDocument/2006/math" xmlns:v="urn:schemas-microsoft-com:vml" xmlns:wp14="http://schemas.microsoft.com/office/word/2010/wordprocessingDrawing" xmlns:wp="http://schemas.openxmlformats.org/drawingml/2006/wordprocessingDrawing" xmlns:w10="urn:schemas-microsoft-com:office:word" xmlns:w="http://schemas.openxmlformats.org/wordprocessingml/2006/main" xmlns:w14="http://schemas.microsoft.com/office/word/2010/wordml" xmlns:w15="http://schemas.microsoft.com/office/word/2012/wordml" xmlns:w16se="http://schemas.microsoft.com/office/word/2015/wordml/symex" xmlns:wpg="http://schemas.microsoft.com/office/word/2010/wordprocessingGroup" xmlns:wpi="http://schemas.microsoft.com/office/word/2010/wordprocessingInk" xmlns:wne="http://schemas.microsoft.com/office/word/2006/wordml" xmlns:wps="http://schemas.microsoft.com/office/word/2010/wordprocessingShape" mc:Ignorable="w14 w15 w16se wp14">
   <w:endnote w:type="separator" w:id="-1">
     <w:p>
       <w:r>
@@ -2130,7 +2545,7 @@
 </file>
 
 <file path=word/footer1.xml><?xml version="1.0" encoding="utf-8"?>
-<w:ftr xmlns:wpc="http://schemas.microsoft.com/office/word/2010/wordprocessingCanvas" xmlns:cx="http://schemas.microsoft.com/office/drawing/2014/chartex" xmlns:cx1="http://schemas.microsoft.com/office/drawing/2015/9/8/chartex" xmlns:cx2="http://schemas.microsoft.com/office/drawing/2015/10/21/chartex" xmlns:cx3="http://schemas.microsoft.com/office/drawing/2016/5/9/chartex" xmlns:cx4="http://schemas.microsoft.com/office/drawing/2016/5/10/chartex" xmlns:cx5="http://schemas.microsoft.com/office/drawing/2016/5/11/chartex" xmlns:cx6="http://schemas.microsoft.com/office/drawing/2016/5/12/chartex" xmlns:cx7="http://schemas.microsoft.com/office/drawing/2016/5/13/chartex" xmlns:cx8="http://schemas.microsoft.com/office/drawing/2016/5/14/chartex" xmlns:mc="http://schemas.openxmlformats.org/markup-compatibility/2006" xmlns:aink="http://schemas.microsoft.com/office/drawing/2016/ink" xmlns:am3d="http://schemas.microsoft.com/office/drawing/2017/model3d" xmlns:o="urn:schemas-microsoft-com:office:office" xmlns:oel="http://schemas.microsoft.com/office/2019/extlst" xmlns:r="http://schemas.openxmlformats.org/officeDocument/2006/relationships" xmlns:m="http://schemas.openxmlformats.org/officeDocument/2006/math" xmlns:v="urn:schemas-microsoft-com:vml" xmlns:wp14="http://schemas.microsoft.com/office/word/2010/wordprocessingDrawing" xmlns:wp="http://schemas.openxmlformats.org/drawingml/2006/wordprocessingDrawing" xmlns:w10="urn:schemas-microsoft-com:office:word" xmlns:w="http://schemas.openxmlformats.org/wordprocessingml/2006/main" xmlns:w14="http://schemas.microsoft.com/office/word/2010/wordml" xmlns:w15="http://schemas.microsoft.com/office/word/2012/wordml" xmlns:w16cex="http://schemas.microsoft.com/office/word/2018/wordml/cex" xmlns:w16cid="http://schemas.microsoft.com/office/word/2016/wordml/cid" xmlns:w16="http://schemas.microsoft.com/office/word/2018/wordml" xmlns:w16du="http://schemas.microsoft.com/office/word/2023/wordml/word16du" xmlns:w16sdtdh="http://schemas.microsoft.com/office/word/2020/wordml/sdtdatahash" xmlns:w16sdtfl="http://schemas.microsoft.com/office/word/2024/wordml/sdtformatlock" xmlns:w16se="http://schemas.microsoft.com/office/word/2015/wordml/symex" xmlns:wpg="http://schemas.microsoft.com/office/word/2010/wordprocessingGroup" xmlns:wpi="http://schemas.microsoft.com/office/word/2010/wordprocessingInk" xmlns:wne="http://schemas.microsoft.com/office/word/2006/wordml" xmlns:wps="http://schemas.microsoft.com/office/word/2010/wordprocessingShape" mc:Ignorable="w14 w15 w16se w16cid w16 w16cex w16sdtdh w16sdtfl w16du wp14">
+<w:ftr xmlns:wpc="http://schemas.microsoft.com/office/word/2010/wordprocessingCanvas" xmlns:cx="http://schemas.microsoft.com/office/drawing/2014/chartex" xmlns:cx1="http://schemas.microsoft.com/office/drawing/2015/9/8/chartex" xmlns:mc="http://schemas.openxmlformats.org/markup-compatibility/2006" xmlns:o="urn:schemas-microsoft-com:office:office" xmlns:r="http://schemas.openxmlformats.org/officeDocument/2006/relationships" xmlns:m="http://schemas.openxmlformats.org/officeDocument/2006/math" xmlns:v="urn:schemas-microsoft-com:vml" xmlns:wp14="http://schemas.microsoft.com/office/word/2010/wordprocessingDrawing" xmlns:wp="http://schemas.openxmlformats.org/drawingml/2006/wordprocessingDrawing" xmlns:w10="urn:schemas-microsoft-com:office:word" xmlns:w="http://schemas.openxmlformats.org/wordprocessingml/2006/main" xmlns:w14="http://schemas.microsoft.com/office/word/2010/wordml" xmlns:w15="http://schemas.microsoft.com/office/word/2012/wordml" xmlns:w16se="http://schemas.microsoft.com/office/word/2015/wordml/symex" xmlns:wpg="http://schemas.microsoft.com/office/word/2010/wordprocessingGroup" xmlns:wpi="http://schemas.microsoft.com/office/word/2010/wordprocessingInk" xmlns:wne="http://schemas.microsoft.com/office/word/2006/wordml" xmlns:wps="http://schemas.microsoft.com/office/word/2010/wordprocessingShape" mc:Ignorable="w14 w15 w16se wp14">
   <w:p>
     <w:pPr>
       <w:jc w:val="right"/>
@@ -2176,7 +2591,7 @@
 </file>
 
 <file path=word/footnotes.xml><?xml version="1.0" encoding="utf-8"?>
-<w:footnotes xmlns:wpc="http://schemas.microsoft.com/office/word/2010/wordprocessingCanvas" xmlns:cx="http://schemas.microsoft.com/office/drawing/2014/chartex" xmlns:cx1="http://schemas.microsoft.com/office/drawing/2015/9/8/chartex" xmlns:cx2="http://schemas.microsoft.com/office/drawing/2015/10/21/chartex" xmlns:cx3="http://schemas.microsoft.com/office/drawing/2016/5/9/chartex" xmlns:cx4="http://schemas.microsoft.com/office/drawing/2016/5/10/chartex" xmlns:cx5="http://schemas.microsoft.com/office/drawing/2016/5/11/chartex" xmlns:cx6="http://schemas.microsoft.com/office/drawing/2016/5/12/chartex" xmlns:cx7="http://schemas.microsoft.com/office/drawing/2016/5/13/chartex" xmlns:cx8="http://schemas.microsoft.com/office/drawing/2016/5/14/chartex" xmlns:mc="http://schemas.openxmlformats.org/markup-compatibility/2006" xmlns:aink="http://schemas.microsoft.com/office/drawing/2016/ink" xmlns:am3d="http://schemas.microsoft.com/office/drawing/2017/model3d" xmlns:o="urn:schemas-microsoft-com:office:office" xmlns:oel="http://schemas.microsoft.com/office/2019/extlst" xmlns:r="http://schemas.openxmlformats.org/officeDocument/2006/relationships" xmlns:m="http://schemas.openxmlformats.org/officeDocument/2006/math" xmlns:v="urn:schemas-microsoft-com:vml" xmlns:wp14="http://schemas.microsoft.com/office/word/2010/wordprocessingDrawing" xmlns:wp="http://schemas.openxmlformats.org/drawingml/2006/wordprocessingDrawing" xmlns:w10="urn:schemas-microsoft-com:office:word" xmlns:w="http://schemas.openxmlformats.org/wordprocessingml/2006/main" xmlns:w14="http://schemas.microsoft.com/office/word/2010/wordml" xmlns:w15="http://schemas.microsoft.com/office/word/2012/wordml" xmlns:w16cex="http://schemas.microsoft.com/office/word/2018/wordml/cex" xmlns:w16cid="http://schemas.microsoft.com/office/word/2016/wordml/cid" xmlns:w16="http://schemas.microsoft.com/office/word/2018/wordml" xmlns:w16du="http://schemas.microsoft.com/office/word/2023/wordml/word16du" xmlns:w16sdtdh="http://schemas.microsoft.com/office/word/2020/wordml/sdtdatahash" xmlns:w16sdtfl="http://schemas.microsoft.com/office/word/2024/wordml/sdtformatlock" xmlns:w16se="http://schemas.microsoft.com/office/word/2015/wordml/symex" xmlns:wpg="http://schemas.microsoft.com/office/word/2010/wordprocessingGroup" xmlns:wpi="http://schemas.microsoft.com/office/word/2010/wordprocessingInk" xmlns:wne="http://schemas.microsoft.com/office/word/2006/wordml" xmlns:wps="http://schemas.microsoft.com/office/word/2010/wordprocessingShape" mc:Ignorable="w14 w15 w16se w16cid w16 w16cex w16sdtdh w16sdtfl w16du wp14">
+<w:footnotes xmlns:wpc="http://schemas.microsoft.com/office/word/2010/wordprocessingCanvas" xmlns:cx="http://schemas.microsoft.com/office/drawing/2014/chartex" xmlns:cx1="http://schemas.microsoft.com/office/drawing/2015/9/8/chartex" xmlns:mc="http://schemas.openxmlformats.org/markup-compatibility/2006" xmlns:o="urn:schemas-microsoft-com:office:office" xmlns:r="http://schemas.openxmlformats.org/officeDocument/2006/relationships" xmlns:m="http://schemas.openxmlformats.org/officeDocument/2006/math" xmlns:v="urn:schemas-microsoft-com:vml" xmlns:wp14="http://schemas.microsoft.com/office/word/2010/wordprocessingDrawing" xmlns:wp="http://schemas.openxmlformats.org/drawingml/2006/wordprocessingDrawing" xmlns:w10="urn:schemas-microsoft-com:office:word" xmlns:w="http://schemas.openxmlformats.org/wordprocessingml/2006/main" xmlns:w14="http://schemas.microsoft.com/office/word/2010/wordml" xmlns:w15="http://schemas.microsoft.com/office/word/2012/wordml" xmlns:w16se="http://schemas.microsoft.com/office/word/2015/wordml/symex" xmlns:wpg="http://schemas.microsoft.com/office/word/2010/wordprocessingGroup" xmlns:wpi="http://schemas.microsoft.com/office/word/2010/wordprocessingInk" xmlns:wne="http://schemas.microsoft.com/office/word/2006/wordml" xmlns:wps="http://schemas.microsoft.com/office/word/2010/wordprocessingShape" mc:Ignorable="w14 w15 w16se wp14">
   <w:footnote w:type="separator" w:id="-1">
     <w:p>
       <w:r>
@@ -2195,7 +2610,7 @@
 </file>
 
 <file path=word/numbering.xml><?xml version="1.0" encoding="utf-8"?>
-<w:numbering xmlns:wpc="http://schemas.microsoft.com/office/word/2010/wordprocessingCanvas" xmlns:cx="http://schemas.microsoft.com/office/drawing/2014/chartex" xmlns:cx1="http://schemas.microsoft.com/office/drawing/2015/9/8/chartex" xmlns:cx2="http://schemas.microsoft.com/office/drawing/2015/10/21/chartex" xmlns:cx3="http://schemas.microsoft.com/office/drawing/2016/5/9/chartex" xmlns:cx4="http://schemas.microsoft.com/office/drawing/2016/5/10/chartex" xmlns:cx5="http://schemas.microsoft.com/office/drawing/2016/5/11/chartex" xmlns:cx6="http://schemas.microsoft.com/office/drawing/2016/5/12/chartex" xmlns:cx7="http://schemas.microsoft.com/office/drawing/2016/5/13/chartex" xmlns:cx8="http://schemas.microsoft.com/office/drawing/2016/5/14/chartex" xmlns:mc="http://schemas.openxmlformats.org/markup-compatibility/2006" xmlns:aink="http://schemas.microsoft.com/office/drawing/2016/ink" xmlns:am3d="http://schemas.microsoft.com/office/drawing/2017/model3d" xmlns:o="urn:schemas-microsoft-com:office:office" xmlns:oel="http://schemas.microsoft.com/office/2019/extlst" xmlns:r="http://schemas.openxmlformats.org/officeDocument/2006/relationships" xmlns:m="http://schemas.openxmlformats.org/officeDocument/2006/math" xmlns:v="urn:schemas-microsoft-com:vml" xmlns:wp14="http://schemas.microsoft.com/office/word/2010/wordprocessingDrawing" xmlns:wp="http://schemas.openxmlformats.org/drawingml/2006/wordprocessingDrawing" xmlns:w10="urn:schemas-microsoft-com:office:word" xmlns:w="http://schemas.openxmlformats.org/wordprocessingml/2006/main" xmlns:w14="http://schemas.microsoft.com/office/word/2010/wordml" xmlns:w15="http://schemas.microsoft.com/office/word/2012/wordml" xmlns:w16cex="http://schemas.microsoft.com/office/word/2018/wordml/cex" xmlns:w16cid="http://schemas.microsoft.com/office/word/2016/wordml/cid" xmlns:w16="http://schemas.microsoft.com/office/word/2018/wordml" xmlns:w16du="http://schemas.microsoft.com/office/word/2023/wordml/word16du" xmlns:w16sdtdh="http://schemas.microsoft.com/office/word/2020/wordml/sdtdatahash" xmlns:w16sdtfl="http://schemas.microsoft.com/office/word/2024/wordml/sdtformatlock" xmlns:w16se="http://schemas.microsoft.com/office/word/2015/wordml/symex" xmlns:wpg="http://schemas.microsoft.com/office/word/2010/wordprocessingGroup" xmlns:wpi="http://schemas.microsoft.com/office/word/2010/wordprocessingInk" xmlns:wne="http://schemas.microsoft.com/office/word/2006/wordml" xmlns:wps="http://schemas.microsoft.com/office/word/2010/wordprocessingShape" mc:Ignorable="w14 w15 w16se w16cid w16 w16cex w16sdtdh w16sdtfl w16du wp14">
+<w:numbering xmlns:wpc="http://schemas.microsoft.com/office/word/2010/wordprocessingCanvas" xmlns:cx="http://schemas.microsoft.com/office/drawing/2014/chartex" xmlns:cx1="http://schemas.microsoft.com/office/drawing/2015/9/8/chartex" xmlns:mc="http://schemas.openxmlformats.org/markup-compatibility/2006" xmlns:o="urn:schemas-microsoft-com:office:office" xmlns:r="http://schemas.openxmlformats.org/officeDocument/2006/relationships" xmlns:m="http://schemas.openxmlformats.org/officeDocument/2006/math" xmlns:v="urn:schemas-microsoft-com:vml" xmlns:wp14="http://schemas.microsoft.com/office/word/2010/wordprocessingDrawing" xmlns:wp="http://schemas.openxmlformats.org/drawingml/2006/wordprocessingDrawing" xmlns:w10="urn:schemas-microsoft-com:office:word" xmlns:w="http://schemas.openxmlformats.org/wordprocessingml/2006/main" xmlns:w14="http://schemas.microsoft.com/office/word/2010/wordml" xmlns:w15="http://schemas.microsoft.com/office/word/2012/wordml" xmlns:w16se="http://schemas.microsoft.com/office/word/2015/wordml/symex" xmlns:wpg="http://schemas.microsoft.com/office/word/2010/wordprocessingGroup" xmlns:wpi="http://schemas.microsoft.com/office/word/2010/wordprocessingInk" xmlns:wne="http://schemas.microsoft.com/office/word/2006/wordml" xmlns:wps="http://schemas.microsoft.com/office/word/2010/wordprocessingShape" mc:Ignorable="w14 w15 w16se wp14">
   <w:abstractNum w:abstractNumId="0" w15:restartNumberingAfterBreak="0">
     <w:nsid w:val="7B537A07"/>
     <w:multiLevelType w:val="hybridMultilevel"/>
@@ -2282,7 +2697,7 @@
       </w:pPr>
     </w:lvl>
   </w:abstractNum>
-  <w:num w:numId="1" w16cid:durableId="2107145322">
+  <w:num w:numId="1">
     <w:abstractNumId w:val="0"/>
     <w:lvlOverride w:ilvl="0">
       <w:startOverride w:val="1"/>
@@ -2292,7 +2707,7 @@
 </file>
 
 <file path=word/styles.xml><?xml version="1.0" encoding="utf-8"?>
-<w:styles xmlns:mc="http://schemas.openxmlformats.org/markup-compatibility/2006" xmlns:r="http://schemas.openxmlformats.org/officeDocument/2006/relationships" xmlns:w="http://schemas.openxmlformats.org/wordprocessingml/2006/main" xmlns:w14="http://schemas.microsoft.com/office/word/2010/wordml" xmlns:w15="http://schemas.microsoft.com/office/word/2012/wordml" xmlns:w16cex="http://schemas.microsoft.com/office/word/2018/wordml/cex" xmlns:w16cid="http://schemas.microsoft.com/office/word/2016/wordml/cid" xmlns:w16="http://schemas.microsoft.com/office/word/2018/wordml" xmlns:w16du="http://schemas.microsoft.com/office/word/2023/wordml/word16du" xmlns:w16sdtdh="http://schemas.microsoft.com/office/word/2020/wordml/sdtdatahash" xmlns:w16sdtfl="http://schemas.microsoft.com/office/word/2024/wordml/sdtformatlock" xmlns:w16se="http://schemas.microsoft.com/office/word/2015/wordml/symex" mc:Ignorable="w14 w15 w16se w16cid w16 w16cex w16sdtdh w16sdtfl w16du">
+<w:styles xmlns:mc="http://schemas.openxmlformats.org/markup-compatibility/2006" xmlns:r="http://schemas.openxmlformats.org/officeDocument/2006/relationships" xmlns:w="http://schemas.openxmlformats.org/wordprocessingml/2006/main" xmlns:w14="http://schemas.microsoft.com/office/word/2010/wordml" xmlns:w15="http://schemas.microsoft.com/office/word/2012/wordml" xmlns:w16se="http://schemas.microsoft.com/office/word/2015/wordml/symex" mc:Ignorable="w14 w15 w16se">
   <w:docDefaults>
     <w:rPrDefault>
       <w:rPr>
@@ -2304,7 +2719,7 @@
     </w:rPrDefault>
     <w:pPrDefault/>
   </w:docDefaults>
-  <w:latentStyles w:defLockedState="0" w:defUIPriority="99" w:defSemiHidden="0" w:defUnhideWhenUsed="0" w:defQFormat="0" w:count="376">
+  <w:latentStyles w:defLockedState="0" w:defUIPriority="99" w:defSemiHidden="0" w:defUnhideWhenUsed="0" w:defQFormat="0" w:count="371">
     <w:lsdException w:name="Normal" w:uiPriority="0" w:qFormat="1"/>
     <w:lsdException w:name="heading 1" w:uiPriority="9" w:qFormat="1"/>
     <w:lsdException w:name="heading 2" w:semiHidden="1" w:uiPriority="9" w:unhideWhenUsed="1" w:qFormat="1"/>
@@ -2676,11 +3091,6 @@
     <w:lsdException w:name="List Table 5 Dark Accent 6" w:uiPriority="50"/>
     <w:lsdException w:name="List Table 6 Colorful Accent 6" w:uiPriority="51"/>
     <w:lsdException w:name="List Table 7 Colorful Accent 6" w:uiPriority="52"/>
-    <w:lsdException w:name="Mention" w:semiHidden="1" w:unhideWhenUsed="1"/>
-    <w:lsdException w:name="Smart Hyperlink" w:semiHidden="1" w:unhideWhenUsed="1"/>
-    <w:lsdException w:name="Hashtag" w:semiHidden="1" w:unhideWhenUsed="1"/>
-    <w:lsdException w:name="Unresolved Mention" w:semiHidden="1" w:unhideWhenUsed="1"/>
-    <w:lsdException w:name="Smart Link" w:semiHidden="1" w:unhideWhenUsed="1"/>
   </w:latentStyles>
   <w:style w:type="paragraph" w:default="1" w:styleId="Normal">
     <w:name w:val="Normal"/>
@@ -2935,6 +3345,32 @@
     <w:link w:val="Footer"/>
     <w:uiPriority w:val="99"/>
     <w:rsid w:val="006B253D"/>
+  </w:style>
+  <w:style w:type="table" w:styleId="TableGrid">
+    <w:name w:val="Table Grid"/>
+    <w:basedOn w:val="TableNormal"/>
+    <w:uiPriority w:val="39"/>
+    <w:rsid w:val="00BF54F2"/>
+    <w:pPr>
+      <w:ind w:firstLine="567"/>
+      <w:jc w:val="both"/>
+    </w:pPr>
+    <w:rPr>
+      <w:rFonts w:eastAsiaTheme="minorEastAsia" w:cstheme="minorBidi"/>
+      <w:bCs/>
+      <w:kern w:val="2"/>
+      <w14:ligatures w14:val="standardContextual"/>
+    </w:rPr>
+    <w:tblPr>
+      <w:tblBorders>
+        <w:top w:val="single" w:sz="4" w:space="0" w:color="auto"/>
+        <w:left w:val="single" w:sz="4" w:space="0" w:color="auto"/>
+        <w:bottom w:val="single" w:sz="4" w:space="0" w:color="auto"/>
+        <w:right w:val="single" w:sz="4" w:space="0" w:color="auto"/>
+        <w:insideH w:val="single" w:sz="4" w:space="0" w:color="auto"/>
+        <w:insideV w:val="single" w:sz="4" w:space="0" w:color="auto"/>
+      </w:tblBorders>
+    </w:tblPr>
   </w:style>
 </w:styles>
 </file>

</xml_diff>